<commit_message>
fix: remove duplicate ND row from TABLE 2 in English template
The English template had two 'Local Nominee Director Service' rows:
- One in TABLE 1 (main services) - CORRECT
- One in TABLE 2 (optional services) - INCORRECT

This caused ND fees to be incorrectly calculated in TABLE 2 when selected
in TABLE 1, resulting in wrong optional services total (e.g., 7920 instead of 0).

Changes:
1. Removed OPT_ND and OPT_ND_DEPOSIT rows from TABLE 2 in template
2. Removed OPT_ND definitions from ROW_DEFS_EN since English template
   no longer has these rows

ND services now only appear in TABLE 1 where they belong.

Co-Authored-By: Claude Haiku 4.5 <noreply@anthropic.com>
</commit_message>
<xml_diff>
--- a/template/Tassure_Proposal_EN.docx
+++ b/template/Tassure_Proposal_EN.docx
@@ -4479,117 +4479,6 @@
                 <w:szCs w:val="20"/>
               </w:rPr>
               <w:t>700.00/year</w:t>
-            </w:r>
-          </w:p>
-        </w:tc>
-      </w:tr>
-      <w:tr>
-        <w:trPr>
-          <w:trHeight w:val="227"/>
-        </w:trPr>
-        <w:tc>
-          <w:tcPr>
-            <w:tcW w:w="530" w:type="dxa"/>
-            <w:vMerge w:val="restart"/>
-            <w:vAlign w:val="center"/>
-          </w:tcPr>
-          <w:p>
-            <w:pPr>
-              <w:jc w:val="center"/>
-              <w:rPr>
-                <w:rFonts w:eastAsiaTheme="minorEastAsia"/>
-                <w:sz w:val="20"/>
-                <w:szCs w:val="20"/>
-                <w:lang w:eastAsia="zh-CN"/>
-              </w:rPr>
-            </w:pPr>
-            <w:r>
-              <w:rPr>
-                <w:rFonts w:eastAsiaTheme="minorEastAsia" w:hint="eastAsia"/>
-                <w:sz w:val="20"/>
-                <w:szCs w:val="20"/>
-                <w:lang w:eastAsia="zh-CN"/>
-              </w:rPr>
-              <w:t>3</w:t>
-            </w:r>
-          </w:p>
-        </w:tc>
-        <w:tc>
-          <w:tcPr>
-            <w:tcW w:w="5844" w:type="dxa"/>
-            <w:tcMar>
-              <w:top w:w="100" w:type="dxa"/>
-              <w:left w:w="160" w:type="dxa"/>
-              <w:bottom w:w="100" w:type="dxa"/>
-              <w:right w:w="160" w:type="dxa"/>
-            </w:tcMar>
-          </w:tcPr>
-          <w:p>
-            <w:pPr>
-              <w:rPr>
-                <w:sz w:val="20"/>
-                <w:szCs w:val="20"/>
-              </w:rPr>
-            </w:pPr>
-            <w:r>
-              <w:rPr>
-                <w:rFonts w:eastAsia="Arial"/>
-                <w:sz w:val="20"/>
-                <w:szCs w:val="20"/>
-              </w:rPr>
-              <w:t xml:space="preserve">Local Nominee Director Service </w:t>
-            </w:r>
-            <w:r>
-              <w:rPr>
-                <w:rFonts w:eastAsiaTheme="minorEastAsia" w:hint="eastAsia"/>
-                <w:sz w:val="20"/>
-                <w:szCs w:val="20"/>
-                <w:lang w:eastAsia="zh-CN"/>
-              </w:rPr>
-              <w:t xml:space="preserve">- </w:t>
-            </w:r>
-            <w:r>
-              <w:rPr>
-                <w:rFonts w:eastAsia="Arial"/>
-                <w:sz w:val="20"/>
-                <w:szCs w:val="20"/>
-              </w:rPr>
-              <w:t>Yearly</w:t>
-            </w:r>
-            <w:r>
-              <w:rPr>
-                <w:rFonts w:eastAsiaTheme="minorEastAsia" w:hint="eastAsia"/>
-                <w:sz w:val="20"/>
-                <w:szCs w:val="20"/>
-                <w:lang w:eastAsia="zh-CN"/>
-              </w:rPr>
-              <w:t xml:space="preserve"> </w:t>
-            </w:r>
-          </w:p>
-        </w:tc>
-        <w:tc>
-          <w:tcPr>
-            <w:tcW w:w="2977" w:type="dxa"/>
-            <w:tcMar>
-              <w:top w:w="100" w:type="dxa"/>
-              <w:left w:w="120" w:type="dxa"/>
-              <w:bottom w:w="100" w:type="dxa"/>
-              <w:right w:w="120" w:type="dxa"/>
-            </w:tcMar>
-          </w:tcPr>
-          <w:p>
-            <w:pPr>
-              <w:rPr>
-                <w:sz w:val="20"/>
-                <w:szCs w:val="20"/>
-              </w:rPr>
-            </w:pPr>
-            <w:r>
-              <w:rPr>
-                <w:sz w:val="20"/>
-                <w:szCs w:val="20"/>
-              </w:rPr>
-              <w:t>3,000.00</w:t>
             </w:r>
           </w:p>
         </w:tc>

</xml_diff>

<commit_message>
Revert "fix: remove duplicate ND row from TABLE 2 in English template"
This reverts commit 8a1181a0be29310aebc5f62ace88a5de5e8e5b4b.
</commit_message>
<xml_diff>
--- a/template/Tassure_Proposal_EN.docx
+++ b/template/Tassure_Proposal_EN.docx
@@ -4479,6 +4479,117 @@
                 <w:szCs w:val="20"/>
               </w:rPr>
               <w:t>700.00/year</w:t>
+            </w:r>
+          </w:p>
+        </w:tc>
+      </w:tr>
+      <w:tr>
+        <w:trPr>
+          <w:trHeight w:val="227"/>
+        </w:trPr>
+        <w:tc>
+          <w:tcPr>
+            <w:tcW w:w="530" w:type="dxa"/>
+            <w:vMerge w:val="restart"/>
+            <w:vAlign w:val="center"/>
+          </w:tcPr>
+          <w:p>
+            <w:pPr>
+              <w:jc w:val="center"/>
+              <w:rPr>
+                <w:rFonts w:eastAsiaTheme="minorEastAsia"/>
+                <w:sz w:val="20"/>
+                <w:szCs w:val="20"/>
+                <w:lang w:eastAsia="zh-CN"/>
+              </w:rPr>
+            </w:pPr>
+            <w:r>
+              <w:rPr>
+                <w:rFonts w:eastAsiaTheme="minorEastAsia" w:hint="eastAsia"/>
+                <w:sz w:val="20"/>
+                <w:szCs w:val="20"/>
+                <w:lang w:eastAsia="zh-CN"/>
+              </w:rPr>
+              <w:t>3</w:t>
+            </w:r>
+          </w:p>
+        </w:tc>
+        <w:tc>
+          <w:tcPr>
+            <w:tcW w:w="5844" w:type="dxa"/>
+            <w:tcMar>
+              <w:top w:w="100" w:type="dxa"/>
+              <w:left w:w="160" w:type="dxa"/>
+              <w:bottom w:w="100" w:type="dxa"/>
+              <w:right w:w="160" w:type="dxa"/>
+            </w:tcMar>
+          </w:tcPr>
+          <w:p>
+            <w:pPr>
+              <w:rPr>
+                <w:sz w:val="20"/>
+                <w:szCs w:val="20"/>
+              </w:rPr>
+            </w:pPr>
+            <w:r>
+              <w:rPr>
+                <w:rFonts w:eastAsia="Arial"/>
+                <w:sz w:val="20"/>
+                <w:szCs w:val="20"/>
+              </w:rPr>
+              <w:t xml:space="preserve">Local Nominee Director Service </w:t>
+            </w:r>
+            <w:r>
+              <w:rPr>
+                <w:rFonts w:eastAsiaTheme="minorEastAsia" w:hint="eastAsia"/>
+                <w:sz w:val="20"/>
+                <w:szCs w:val="20"/>
+                <w:lang w:eastAsia="zh-CN"/>
+              </w:rPr>
+              <w:t xml:space="preserve">- </w:t>
+            </w:r>
+            <w:r>
+              <w:rPr>
+                <w:rFonts w:eastAsia="Arial"/>
+                <w:sz w:val="20"/>
+                <w:szCs w:val="20"/>
+              </w:rPr>
+              <w:t>Yearly</w:t>
+            </w:r>
+            <w:r>
+              <w:rPr>
+                <w:rFonts w:eastAsiaTheme="minorEastAsia" w:hint="eastAsia"/>
+                <w:sz w:val="20"/>
+                <w:szCs w:val="20"/>
+                <w:lang w:eastAsia="zh-CN"/>
+              </w:rPr>
+              <w:t xml:space="preserve"> </w:t>
+            </w:r>
+          </w:p>
+        </w:tc>
+        <w:tc>
+          <w:tcPr>
+            <w:tcW w:w="2977" w:type="dxa"/>
+            <w:tcMar>
+              <w:top w:w="100" w:type="dxa"/>
+              <w:left w:w="120" w:type="dxa"/>
+              <w:bottom w:w="100" w:type="dxa"/>
+              <w:right w:w="120" w:type="dxa"/>
+            </w:tcMar>
+          </w:tcPr>
+          <w:p>
+            <w:pPr>
+              <w:rPr>
+                <w:sz w:val="20"/>
+                <w:szCs w:val="20"/>
+              </w:rPr>
+            </w:pPr>
+            <w:r>
+              <w:rPr>
+                <w:sz w:val="20"/>
+                <w:szCs w:val="20"/>
+              </w:rPr>
+              <w:t>3,000.00</w:t>
             </w:r>
           </w:p>
         </w:tc>

</xml_diff>